<commit_message>
Add __init__.py files for package recognition
</commit_message>
<xml_diff>
--- a/creativeflow_output.docx
+++ b/creativeflow_output.docx
@@ -19,7 +19,7 @@
         <w:t xml:space="preserve">Prompt: </w:t>
       </w:r>
       <w:r>
-        <w:t>a blue sky full of joy</w:t>
+        <w:t>boy in hell</w:t>
       </w:r>
     </w:p>
     <w:p>
@@ -30,7 +30,7 @@
         <w:t xml:space="preserve">Mood: </w:t>
       </w:r>
       <w:r>
-        <w:t xml:space="preserve">Playful   </w:t>
+        <w:t xml:space="preserve">Mysterious   </w:t>
       </w:r>
       <w:r>
         <w:rPr>
@@ -39,7 +39,7 @@
         <w:t xml:space="preserve">Genre: </w:t>
       </w:r>
       <w:r>
-        <w:t>Fantasy</w:t>
+        <w:t>Sci-fi</w:t>
       </w:r>
     </w:p>
     <w:p/>
@@ -48,21 +48,21 @@
         <w:pStyle w:val="Heading1"/>
       </w:pPr>
       <w:r>
-        <w:t>📖 Story: Beneath the Canvas of Endless Blue</w:t>
+        <w:t>📖 Story: Infernal Awakening</w:t>
       </w:r>
     </w:p>
     <w:p>
       <w:r>
-        <w:t>In a world where the sky was a brilliant blue, a young dreamer named Luna felt an insatiable sense of wonder. She would often lie on a hill, gazing up at the endless expanse, and imagine that the sky was a canvas of infinite possibilities. One day, as she was lost in her reverie, a gentle breeze carried her away to a realm where the blue sky was alive. The sky, it seemed, was not just a backdrop for the sun and clouds, but a gateway to a world of enchantment.</w:t>
+        <w:t>In the depths of a dystopian metropolis, where crimson skies raged with perpetual storms and skyscrapers pierced the heavens like shards of splintered bone, a young boy found himself trapped in a realm of unrelenting terror. The air reeked of ozone and burning circuitry, as if the very fabric of reality was being ravaged by an otherworldly force. His name was lost to the void, erased from his mind like a deleted file, leaving only an eerie sense of disconnection and a burning desire to escape.</w:t>
         <w:br/>
         <w:br/>
-        <w:t>As Luna soared through the air, she felt a deep sense of freedom, unencumbered by the weights of the world. She twirled and spun, her laughter echoing through the sky, and her heart full of joy. The blue sky, now a vibrant tapestry, began to reveal its secrets to her. She saw wispy brushstrokes of cirrus clouds, swirling patterns of cumulus, and vibrant splashes of color that danced across the sky. Every moment was a testament to the boundless magic that lay just beyond the reach of mundane life.</w:t>
+        <w:t>As he navigated the twisted labyrinth of neon-drenched corridors and dark alleys, the boy encountered an unholy fusion of technology and demonic entities. Cybernetic abominations, with eyes that glowed like hot coals, prowled the shadows, their twisted forms a testament to the unholy marriage of flesh and machine. The boy's own body seemed to be evolving, his veins coursing with a strange, pulsating energy that hinted at a darker purpose.</w:t>
         <w:br/>
         <w:br/>
-        <w:t>With each passing moment, Luna's imagination ran wild, and she began to craft her own tales within the sky's canvas. She conjured up fantastical creatures, wondrous landscapes, and epic adventures, all set against the brilliant blue backdrop. As she created, the sky responded, bringing her dreams to life in dazzling displays of light and color. Hope and freedom intertwined, as Luna realized that the sky's endless possibilities were a reflection of her own potential.</w:t>
+        <w:t>With each step, the boy's memories began to resurface, like whispers from a forgotten past. He recalled fragments of a life before this hellish world, of loved ones and a warmth that seemed almost mythical in this desolate landscape. But the more he remembered, the more he realized that his presence in this realm was not a coincidence. He was here for a reason, a reason that was inextricably linked to the secrets of his past and the mysteries of this forsaken world.</w:t>
         <w:br/>
         <w:br/>
-        <w:t>In this mystical realm, Luna discovered that the blue sky was not just a source of inspiration, but a reminder that the boundaries of reality were mere suggestions. As she explored the sky's depths, she knew that she would always carry its magic with her, and that the world beneath the canvas of endless blue would forever be a place of wonder, joy, and limitless imagination. And when she finally returned to her world, Luna's heart remained filled with the sky's radiant beauty, illuminating her path and guiding her toward a future filled with promise and endless possibility.</w:t>
+        <w:t>As the boy delved deeper into the underworld, he encountered enigmatic figures who seemed to hold the keys to his redemption. A mysterious hacker, with eyes that shone like stars in the darkness, guided him through the treacherous landscape, whispering cryptic warnings of an ancient evil that stirred in the depths of the city. The boy's journey was one of survival, of self-discovery, and of unraveling the tangled threads of his own destiny. Would he find a way to escape this infernal realm, or would he succumb to the darkness that surrounded him, forever lost in the abyss of his own forgotten soul? Only time would tell, as the boy pressed on, driven by a fierce determination to reclaim his past and forge a new future, one that would rise from the ashes of this hellish world like a phoenix born of fire and steel.</w:t>
       </w:r>
     </w:p>
     <w:p>
@@ -70,7 +70,7 @@
         <w:rPr>
           <w:i/>
         </w:rPr>
-        <w:t>Framework: Hero's Journey with a twist of wonder and magic, where the protagonist discovers a world of endless possibilities under the blue sky | Words: 352</w:t>
+        <w:t>Framework: A young boy finds himself trapped in a hellish, futuristic world where technology and demons coexist, and must navigate the underworld to uncover the secrets of his past and find a way to escape | Words: 384</w:t>
       </w:r>
     </w:p>
     <w:p/>
@@ -79,7 +79,7 @@
         <w:pStyle w:val="Heading1"/>
       </w:pPr>
       <w:r>
-        <w:t>🎵 Music: Blue Horizon Delight</w:t>
+        <w:t>🎵 Music: Burning Inferno</w:t>
       </w:r>
     </w:p>
     <w:p>
@@ -90,7 +90,7 @@
         <w:t xml:space="preserve">Tempo: </w:t>
       </w:r>
       <w:r>
-        <w:t xml:space="preserve">Upbeat   </w:t>
+        <w:t xml:space="preserve">slow and ominous   </w:t>
       </w:r>
       <w:r>
         <w:rPr>
@@ -99,7 +99,7 @@
         <w:t xml:space="preserve">Chords: </w:t>
       </w:r>
       <w:r>
-        <w:t>I-V-vi-IV</w:t>
+        <w:t>minor key progression with discordant notes</w:t>
       </w:r>
     </w:p>
     <w:p/>
@@ -113,37 +113,70 @@
     </w:p>
     <w:p>
       <w:r>
-        <w:t>[Verse 1]</w:t>
+        <w:t>Verse</w:t>
         <w:br/>
-        <w:t>In a world where skies are always blue</w:t>
+        <w:t>In the depths of a world unseen, where shadows roam and darkness reigns</w:t>
         <w:br/>
-        <w:t>The sun shines bright, with a smile or two</w:t>
+        <w:t>A boy awakens, lost and alone, with memories that refuse to remain</w:t>
         <w:br/>
-        <w:t>The clouds are fluffy, the breeze is light</w:t>
+        <w:t>He's trapped in a realm of eternal pain, with no escape from the burning flames</w:t>
         <w:br/>
-        <w:t>Everything feels just right</w:t>
+        <w:t>His heart beats strong, but his soul's in chains, searching for a way to break the claim</w:t>
         <w:br/>
         <w:br/>
-        <w:t>[Chorus]</w:t>
+        <w:t>Chorus</w:t>
         <w:br/>
-        <w:t>We're dancing on the blue horizon high</w:t>
+        <w:t>He's a boy in hell, fighting to survive</w:t>
         <w:br/>
-        <w:t>With feathers in our hair, and a twinkle in our eye</w:t>
+        <w:t>With every breath, he's gonna stay alive</w:t>
         <w:br/>
-        <w:t>We're chasing sunbeams, and laughing with glee</w:t>
+        <w:t>In this burning inferno, he's gonna find his way</w:t>
         <w:br/>
-        <w:t>In this world of wonder, we're free to be</w:t>
+        <w:t>Through the darkness and the pain, he's gonna seize the day</w:t>
         <w:br/>
         <w:br/>
-        <w:t>[Verse 2]</w:t>
+        <w:t>Verse</w:t>
         <w:br/>
-        <w:t>The flowers bloom, in every hue</w:t>
+        <w:t>He navigates through the twisted maze, with walls that shift and floors that sway</w:t>
         <w:br/>
-        <w:t>The trees sway gently, with a rhythm or two</w:t>
+        <w:t>He's haunted by the ghosts of his past, with whispers that won't fade away</w:t>
         <w:br/>
-        <w:t>The creatures sing, in perfect harmony</w:t>
+        <w:t>He's driven by a fire that burns inside, a flame that flickers but never dies</w:t>
         <w:br/>
-        <w:t>In this world of enchantment, we're wild and free</w:t>
+        <w:t>He's reaching for a light, a guiding star, to lead him through the darkest skies</w:t>
+        <w:br/>
+        <w:br/>
+        <w:t>Chorus</w:t>
+        <w:br/>
+        <w:t>He's a boy in hell, fighting to survive</w:t>
+        <w:br/>
+        <w:t>With every breath, he's gonna stay alive</w:t>
+        <w:br/>
+        <w:t>In this burning inferno, he's gonna find his way</w:t>
+        <w:br/>
+        <w:t>Through the darkness and the pain, he's gonna seize the day</w:t>
+        <w:br/>
+        <w:br/>
+        <w:t>Bridge</w:t>
+        <w:br/>
+        <w:t>In the silence, he hears a voice, a whispered truth that makes him choose</w:t>
+        <w:br/>
+        <w:t>Between the darkness and the light, he's gonna rise above the noise</w:t>
+        <w:br/>
+        <w:t>With every step, he's gonna find his strength, his heart beating like a drum</w:t>
+        <w:br/>
+        <w:t>He's gonna rise up, and shine like the sun, and burn the hell away, and have won</w:t>
+        <w:br/>
+        <w:br/>
+        <w:t>Chorus</w:t>
+        <w:br/>
+        <w:t>He's a boy in hell, fighting to survive</w:t>
+        <w:br/>
+        <w:t>With every breath, he's gonna stay alive</w:t>
+        <w:br/>
+        <w:t>In this burning inferno, he's gonna find his way</w:t>
+        <w:br/>
+        <w:t>Through the darkness and the pain, he's gonna seize the day</w:t>
       </w:r>
     </w:p>
     <w:p/>
@@ -155,7 +188,7 @@
         <w:t xml:space="preserve">Production Notes: </w:t>
       </w:r>
       <w:r>
-        <w:t>To produce this track, start with a bouncy piano riff, accompanied by a bright and airy flute melody, following the I-V-vi-IV chord progression. Add a lively guitar strumming pattern to enhance the upbeat tempo and playful feel. The instrumentation should be balanced to create a sense of movement and joy, with each element complementing the others to bring the fantasy world to life.</w:t>
+        <w:t>To achieve the desired slow and ominous tempo, use a combination of driving drums and prominent bass guitar to create a sense of tension and release. Experiment with distorted electric guitar tones and minor key progressions to add a sense of discord and rebellion to the track. Use vocal processing techniques such as reverb and delay to create a sense of space and depth, and to enhance the emotional impact of the lyrics.</w:t>
       </w:r>
     </w:p>
     <w:p/>
@@ -164,12 +197,12 @@
         <w:pStyle w:val="Heading1"/>
       </w:pPr>
       <w:r>
-        <w:t>🎨 Visual: Celestial Playground</w:t>
+        <w:t>🎨 Visual: Descent into Neon Hell</w:t>
       </w:r>
     </w:p>
     <w:p>
       <w:r>
-        <w:t>In a world where joy is palpable, a bright blue sky transforms into a vibrant playground, filled with fluffy white clouds that resemble cotton candy. The atmosphere is alive with an infectious energy, as if the sky itself is smiling down on the world. Amidst this whimsical setting, fantastical creatures and objects float effortlessly, inviting all to join in the fun.</w:t>
+        <w:t>In a dystopian underworld, a lone boy navigates through a labyrinthine cityscape, surrounded by towering skyscrapers and narrow alleyways that seem to swallow him whole. The air is thick with smoke and ash, and the only light comes from flickering neon signs that cast an eerie glow. As he walks, the boy's footsteps echo off the walls, and the shadows seem to move of their own accord.</w:t>
       </w:r>
     </w:p>
     <w:p>
@@ -180,7 +213,7 @@
         <w:t xml:space="preserve">Color Story: </w:t>
       </w:r>
       <w:r>
-        <w:t>The color palette is dominated by a soothing cerulean blue, complemented by bursts of sunshine yellow and soft mint green, evoking a sense of carefree playfulness and happiness. As the colors blend and swirl, they create a mesmerizing visual harmony that captivates the imagination and transports viewers to a world of unbridled joy.</w:t>
+        <w:t>The color palette is a dark and foreboding mix of deep reds and smoky greys, punctuated by flashes of neon blue that seem to pulse with an otherworldly energy. The overall effect is one of menacing unease, as if the very walls are watching the boy's every move.</w:t>
       </w:r>
     </w:p>
     <w:p/>
@@ -197,7 +230,7 @@
         <w:pStyle w:val="ListBullet"/>
       </w:pPr>
       <w:r>
-        <w:t>- Delicate, lace-like cloud formations that resemble intricate circus tents</w:t>
+        <w:t>- A massive, crumbling skyscraper looms in the background, its facade cracked and overgrown with vines and wires</w:t>
       </w:r>
     </w:p>
     <w:p>
@@ -205,7 +238,7 @@
         <w:pStyle w:val="ListBullet"/>
       </w:pPr>
       <w:r>
-        <w:t>- A sprinkle of glittering, iridescent stardust that shimmers like diamonds against the blue sky</w:t>
+        <w:t>- The boy's figure is small and isolated, dressed in tattered clothing and carrying a faintly glowing staff</w:t>
       </w:r>
     </w:p>
     <w:p>
@@ -213,7 +246,7 @@
         <w:pStyle w:val="ListBullet"/>
       </w:pPr>
       <w:r>
-        <w:t>- Fantastical, hot air balloon-like creatures with colorful, striped envelopes and oversized, smiling faces</w:t>
+        <w:t>- Neon signs and advertisements line the walls, casting a gaudy glow over the dark scenery</w:t>
       </w:r>
     </w:p>
     <w:p>
@@ -221,7 +254,7 @@
         <w:pStyle w:val="ListBullet"/>
       </w:pPr>
       <w:r>
-        <w:t>- A winding, sparkling rainbow-colored slide that weaves through the clouds, inviting all to take a thrilling ride</w:t>
+        <w:t>- A haze of smoke and ash hangs in the air, obscuring the boy's vision and adding to the sense of disorientation</w:t>
       </w:r>
     </w:p>
     <w:p/>
@@ -235,7 +268,7 @@
     </w:p>
     <w:p>
       <w:r>
-        <w:t>Create an illustration of a vibrant, whimsical sky filled with an assortment of fantastical elements, including delicate cloud formations, hot air balloon creatures, and a winding rainbow slide, all set against a brilliant cerulean blue background with touches of sunshine yellow and mint green. The atmosphere should be soft and airy, with an emphasis on playful, carefree energy, as if the sky itself is alive and rejoicing in the simple act of being. Incorporate surreal, dreamlike elements reminiscent of surrealist paintings and fantasy illustrations, blending reality and fantasy in a captivating, imaginative world where joy knows no bounds.</w:t>
+        <w:t>Generate an image of a young boy standing alone in a dark, cyberpunk cityscape, surrounded by towering skyscrapers and narrow alleyways that seem to stretch on forever. The boy is dressed in tattered clothing and carries a faintly glowing staff, and his eyes are cast downward as if he's navigating through the shadows. The air is thick with smoke and ash, and the only light comes from flickering neon signs that cast an eerie glow over the scene, with flashes of neon blue pulsing through the darkness like a heartbeat. In the background, a massive, crumbling skyscraper looms, its facade cracked and overgrown with vines and wires, and the overall atmosphere is one of ominous foreboding, as if the boy is being watched by unseen eyes. The color palette should be a dark and muted mix of deep reds, smoky greys, and neon blues, with the neon signs and advertisements casting a gaudy glow over the dark scenery.</w:t>
       </w:r>
     </w:p>
     <w:sectPr>

</xml_diff>